<commit_message>
refactor: generalize shared-platforms analysis to use final pipeline output
- Rename analysis/L9_L10.py to shared_platforms.py
- Derive shared platform pairs from subway_route_names_stop_ids instead of hardcoding them
- Read from stop_times_doors.txt (final pipeline output) instead of stop_times_sequence.txt
- Add a verification check after deduplication in stop_times_checks.ipynb
- Expose round_half_up_mean from gtfs_utils
</commit_message>
<xml_diff>
--- a/.docu/Pesos.docx
+++ b/.docu/Pesos.docx
@@ -1,6 +1,6 @@
 
 <file path=word/document.xml><?xml version="1.0" encoding="utf-8"?>
-<w:document xmlns:wpc="http://schemas.microsoft.com/office/word/2010/wordprocessingCanvas" xmlns:cx="http://schemas.microsoft.com/office/drawing/2014/chartex" xmlns:cx1="http://schemas.microsoft.com/office/drawing/2015/9/8/chartex" xmlns:cx2="http://schemas.microsoft.com/office/drawing/2015/10/21/chartex" xmlns:cx3="http://schemas.microsoft.com/office/drawing/2016/5/9/chartex" xmlns:cx4="http://schemas.microsoft.com/office/drawing/2016/5/10/chartex" xmlns:cx5="http://schemas.microsoft.com/office/drawing/2016/5/11/chartex" xmlns:cx6="http://schemas.microsoft.com/office/drawing/2016/5/12/chartex" xmlns:cx7="http://schemas.microsoft.com/office/drawing/2016/5/13/chartex" xmlns:cx8="http://schemas.microsoft.com/office/drawing/2016/5/14/chartex" xmlns:mc="http://schemas.openxmlformats.org/markup-compatibility/2006" xmlns:aink="http://schemas.microsoft.com/office/drawing/2016/ink" xmlns:am3d="http://schemas.microsoft.com/office/drawing/2017/model3d" xmlns:o="urn:schemas-microsoft-com:office:office" xmlns:oel="http://schemas.microsoft.com/office/2019/extlst" xmlns:r="http://schemas.openxmlformats.org/officeDocument/2006/relationships" xmlns:m="http://schemas.openxmlformats.org/officeDocument/2006/math" xmlns:v="urn:schemas-microsoft-com:vml" xmlns:wp14="http://schemas.microsoft.com/office/word/2010/wordprocessingDrawing" xmlns:wp="http://schemas.openxmlformats.org/drawingml/2006/wordprocessingDrawing" xmlns:w10="urn:schemas-microsoft-com:office:word" xmlns:w="http://schemas.openxmlformats.org/wordprocessingml/2006/main" xmlns:w14="http://schemas.microsoft.com/office/word/2010/wordml" xmlns:w15="http://schemas.microsoft.com/office/word/2012/wordml" xmlns:w16cex="http://schemas.microsoft.com/office/word/2018/wordml/cex" xmlns:w16cid="http://schemas.microsoft.com/office/word/2016/wordml/cid" xmlns:w16="http://schemas.microsoft.com/office/word/2018/wordml" xmlns:w16du="http://schemas.microsoft.com/office/word/2023/wordml/word16du" xmlns:w16sdtdh="http://schemas.microsoft.com/office/word/2020/wordml/sdtdatahash" xmlns:w16sdtfl="http://schemas.microsoft.com/office/word/2024/wordml/sdtformatlock" xmlns:w16se="http://schemas.microsoft.com/office/word/2015/wordml/symex" xmlns:wpg="http://schemas.microsoft.com/office/word/2010/wordprocessingGroup" xmlns:wpi="http://schemas.microsoft.com/office/word/2010/wordprocessingInk" xmlns:wne="http://schemas.microsoft.com/office/word/2006/wordml" xmlns:wps="http://schemas.microsoft.com/office/word/2010/wordprocessingShape" mc:Ignorable="w14 w15 w16se w16cid w16 w16cex w16sdtdh w16sdtfl w16du wp14">
+<w:document xmlns:wpc="http://schemas.microsoft.com/office/word/2010/wordprocessingCanvas" xmlns:cx="http://schemas.microsoft.com/office/drawing/2014/chartex" xmlns:cx1="http://schemas.microsoft.com/office/drawing/2015/9/8/chartex" xmlns:cx2="http://schemas.microsoft.com/office/drawing/2015/10/21/chartex" xmlns:cx3="http://schemas.microsoft.com/office/drawing/2016/5/9/chartex" xmlns:cx4="http://schemas.microsoft.com/office/drawing/2016/5/10/chartex" xmlns:cx5="http://schemas.microsoft.com/office/drawing/2016/5/11/chartex" xmlns:cx6="http://schemas.microsoft.com/office/drawing/2016/5/12/chartex" xmlns:cx7="http://schemas.microsoft.com/office/drawing/2016/5/13/chartex" xmlns:cx8="http://schemas.microsoft.com/office/drawing/2016/5/14/chartex" xmlns:mc="http://schemas.openxmlformats.org/markup-compatibility/2006" xmlns:m="http://schemas.openxmlformats.org/officeDocument/2006/math" xmlns:aink="http://schemas.microsoft.com/office/drawing/2016/ink" xmlns:am3d="http://schemas.microsoft.com/office/drawing/2017/model3d" xmlns:oel="http://schemas.microsoft.com/office/2019/extlst" xmlns:r="http://schemas.openxmlformats.org/officeDocument/2006/relationships" xmlns:wp14="http://schemas.microsoft.com/office/word/2010/wordprocessingDrawing" xmlns:wp="http://schemas.openxmlformats.org/drawingml/2006/wordprocessingDrawing" xmlns:wpg="http://schemas.microsoft.com/office/word/2010/wordprocessingGroup" xmlns:wpi="http://schemas.microsoft.com/office/word/2010/wordprocessingInk" xmlns:wps="http://schemas.microsoft.com/office/word/2010/wordprocessingShape" xmlns:o="urn:schemas-microsoft-com:office:office" xmlns:v="urn:schemas-microsoft-com:vml" xmlns:w10="urn:schemas-microsoft-com:office:word" xmlns:w="http://schemas.openxmlformats.org/wordprocessingml/2006/main" xmlns:w14="http://schemas.microsoft.com/office/word/2010/wordml" xmlns:w15="http://schemas.microsoft.com/office/word/2012/wordml" xmlns:w16cex="http://schemas.microsoft.com/office/word/2018/wordml/cex" xmlns:w16cid="http://schemas.microsoft.com/office/word/2016/wordml/cid" xmlns:w16="http://schemas.microsoft.com/office/word/2018/wordml" xmlns:w16sdtdh="http://schemas.microsoft.com/office/word/2020/wordml/sdtdatahash" xmlns:w16sdtfl="http://schemas.microsoft.com/office/word/2024/wordml/sdtformatlock" xmlns:w16se="http://schemas.microsoft.com/office/word/2015/wordml/symex" xmlns:w16du="http://schemas.microsoft.com/office/word/2023/wordml/word16du" xmlns:wne="http://schemas.microsoft.com/office/word/2006/wordml" mc:Ignorable="w14 w15 w16se w16cid w16 w16cex w16sdtdh w16sdtfl w16du wp14">
   <w:body>
     <w:p>
       <w:pPr>
@@ -451,13 +451,7 @@
         <w:rPr>
           <w:rFonts w:ascii="Arial" w:hAnsi="Arial" w:cs="Arial"/>
         </w:rPr>
-        <w:t xml:space="preserve">S’ha inclòs c) dins de SW perquè </w:t>
-      </w:r>
-      <w:r>
-        <w:rPr>
-          <w:rFonts w:ascii="Arial" w:hAnsi="Arial" w:cs="Arial"/>
-        </w:rPr>
-        <w:t xml:space="preserve">encara que el Dijkstra i l’A* permeten bucles en un graf (aresta que comença i acaba al mateix vèrtex), mai s’inclouran aquests pesos a la longitud final del camí trobat. </w:t>
+        <w:t xml:space="preserve">S’ha inclòs c) dins de SW perquè encara que el Dijkstra i l’A* permeten bucles en un graf (aresta que comença i acaba al mateix vèrtex), mai s’inclouran aquests pesos a la longitud final del camí trobat. </w:t>
       </w:r>
       <w:r>
         <w:rPr>
@@ -499,7 +493,19 @@
         <w:rPr>
           <w:rFonts w:ascii="Arial" w:hAnsi="Arial" w:cs="Arial"/>
         </w:rPr>
-        <w:t xml:space="preserve">Un cas particular de c) és a la primera parada en la que s’agafa el metro (ja sigui en un </w:t>
+        <w:t xml:space="preserve">Un cas particular de c) és a la primera parada </w:t>
+      </w:r>
+      <w:r>
+        <w:rPr>
+          <w:rFonts w:ascii="Arial" w:hAnsi="Arial" w:cs="Arial"/>
+        </w:rPr>
+        <w:t xml:space="preserve">d’un tram de metro </w:t>
+      </w:r>
+      <w:r>
+        <w:rPr>
+          <w:rFonts w:ascii="Arial" w:hAnsi="Arial" w:cs="Arial"/>
+        </w:rPr>
+        <w:t xml:space="preserve">(ja sigui en un </w:t>
       </w:r>
       <w:r>
         <w:rPr>
@@ -587,6 +593,305 @@
         <w:lastRenderedPageBreak/>
         <w:t>temps entre baixar-te del metro, que aquest se’n vagi, arribi el nou de l’altra línia i pujar-te siguin 15s perquè és el mínim temps existent a ‘pathways’. Amb la duplicació artifical d’aquestes andanes posarem aquest pes com un PW entre elles.</w:t>
       </w:r>
+    </w:p>
+    <w:p>
+      <w:pPr>
+        <w:rPr>
+          <w:rFonts w:ascii="Arial" w:hAnsi="Arial" w:cs="Arial"/>
+        </w:rPr>
+      </w:pPr>
+    </w:p>
+    <w:p>
+      <w:pPr>
+        <w:pStyle w:val="ListParagraph"/>
+        <w:numPr>
+          <w:ilvl w:val="0"/>
+          <w:numId w:val="1"/>
+        </w:numPr>
+        <w:spacing w:line="259" w:lineRule="auto"/>
+        <w:rPr>
+          <w:rFonts w:ascii="Arial" w:hAnsi="Arial"/>
+          <w:color w:val="BFBFBF" w:themeColor="background1" w:themeShade="BF"/>
+        </w:rPr>
+      </w:pPr>
+      <w:r>
+        <w:rPr>
+          <w:rFonts w:ascii="Arial" w:hAnsi="Arial"/>
+          <w:color w:val="BFBFBF" w:themeColor="background1" w:themeShade="BF"/>
+        </w:rPr>
+        <w:t>Pesos</w:t>
+      </w:r>
+    </w:p>
+    <w:p>
+      <w:pPr>
+        <w:pStyle w:val="ListParagraph"/>
+        <w:numPr>
+          <w:ilvl w:val="1"/>
+          <w:numId w:val="1"/>
+        </w:numPr>
+        <w:spacing w:line="259" w:lineRule="auto"/>
+        <w:rPr>
+          <w:rFonts w:ascii="Arial" w:hAnsi="Arial"/>
+          <w:color w:val="BFBFBF" w:themeColor="background1" w:themeShade="BF"/>
+        </w:rPr>
+      </w:pPr>
+      <w:r>
+        <w:rPr>
+          <w:rFonts w:ascii="Arial" w:hAnsi="Arial"/>
+          <w:color w:val="BFBFBF" w:themeColor="background1" w:themeShade="BF"/>
+        </w:rPr>
+        <w:t>“pathway” (PW)</w:t>
+      </w:r>
+    </w:p>
+    <w:p>
+      <w:pPr>
+        <w:pStyle w:val="ListParagraph"/>
+        <w:numPr>
+          <w:ilvl w:val="2"/>
+          <w:numId w:val="1"/>
+        </w:numPr>
+        <w:rPr>
+          <w:rFonts w:ascii="Arial" w:hAnsi="Arial" w:cs="Arial"/>
+          <w:color w:val="BFBFBF" w:themeColor="background1" w:themeShade="BF"/>
+        </w:rPr>
+      </w:pPr>
+      <w:r>
+        <w:rPr>
+          <w:rFonts w:ascii="Arial" w:hAnsi="Arial" w:cs="Arial"/>
+          <w:color w:val="BFBFBF" w:themeColor="background1" w:themeShade="BF"/>
+        </w:rPr>
+        <w:t>D’andana a andana</w:t>
+      </w:r>
+    </w:p>
+    <w:p>
+      <w:pPr>
+        <w:pStyle w:val="ListParagraph"/>
+        <w:numPr>
+          <w:ilvl w:val="2"/>
+          <w:numId w:val="1"/>
+        </w:numPr>
+        <w:rPr>
+          <w:rFonts w:ascii="Arial" w:hAnsi="Arial" w:cs="Arial"/>
+          <w:color w:val="BFBFBF" w:themeColor="background1" w:themeShade="BF"/>
+        </w:rPr>
+      </w:pPr>
+      <w:r>
+        <w:rPr>
+          <w:rFonts w:ascii="Arial" w:hAnsi="Arial" w:cs="Arial"/>
+          <w:color w:val="BFBFBF" w:themeColor="background1" w:themeShade="BF"/>
+        </w:rPr>
+        <w:t>D’entrada a andana</w:t>
+      </w:r>
+    </w:p>
+    <w:p>
+      <w:pPr>
+        <w:pStyle w:val="ListParagraph"/>
+        <w:numPr>
+          <w:ilvl w:val="1"/>
+          <w:numId w:val="1"/>
+        </w:numPr>
+        <w:spacing w:line="259" w:lineRule="auto"/>
+        <w:rPr>
+          <w:rFonts w:ascii="Arial" w:hAnsi="Arial"/>
+          <w:color w:val="BFBFBF" w:themeColor="background1" w:themeShade="BF"/>
+        </w:rPr>
+      </w:pPr>
+      <w:r>
+        <w:rPr>
+          <w:rFonts w:ascii="Arial" w:hAnsi="Arial"/>
+          <w:color w:val="BFBFBF" w:themeColor="background1" w:themeShade="BF"/>
+        </w:rPr>
+        <w:t>“subway” (SW)</w:t>
+      </w:r>
+    </w:p>
+    <w:p>
+      <w:pPr>
+        <w:pStyle w:val="ListParagraph"/>
+        <w:numPr>
+          <w:ilvl w:val="2"/>
+          <w:numId w:val="1"/>
+        </w:numPr>
+        <w:spacing w:line="259" w:lineRule="auto"/>
+        <w:rPr>
+          <w:rFonts w:ascii="Arial" w:hAnsi="Arial"/>
+          <w:color w:val="BFBFBF" w:themeColor="background1" w:themeShade="BF"/>
+        </w:rPr>
+      </w:pPr>
+      <w:r>
+        <w:rPr>
+          <w:rFonts w:ascii="Arial" w:hAnsi="Arial"/>
+          <w:color w:val="BFBFBF" w:themeColor="background1" w:themeShade="BF"/>
+        </w:rPr>
+        <w:t>Per aquella seqüència amb orientació la mitjana</w:t>
+      </w:r>
+    </w:p>
+    <w:p>
+      <w:pPr>
+        <w:pStyle w:val="ListParagraph"/>
+        <w:numPr>
+          <w:ilvl w:val="3"/>
+          <w:numId w:val="1"/>
+        </w:numPr>
+        <w:spacing w:line="259" w:lineRule="auto"/>
+        <w:rPr>
+          <w:rFonts w:ascii="Arial" w:hAnsi="Arial"/>
+          <w:color w:val="BFBFBF" w:themeColor="background1" w:themeShade="BF"/>
+        </w:rPr>
+      </w:pPr>
+      <w:r>
+        <w:rPr>
+          <w:rFonts w:ascii="Arial" w:hAnsi="Arial"/>
+          <w:color w:val="BFBFBF" w:themeColor="background1" w:themeShade="BF"/>
+        </w:rPr>
+        <w:t>Dins de trips, per cada route_id i cada trip_id (tenint en compte la direction_id)</w:t>
+      </w:r>
+    </w:p>
+    <w:p>
+      <w:pPr>
+        <w:pStyle w:val="ListParagraph"/>
+        <w:numPr>
+          <w:ilvl w:val="1"/>
+          <w:numId w:val="1"/>
+        </w:numPr>
+        <w:spacing w:line="259" w:lineRule="auto"/>
+        <w:rPr>
+          <w:rFonts w:ascii="Arial" w:hAnsi="Arial"/>
+          <w:color w:val="BFBFBF" w:themeColor="background1" w:themeShade="BF"/>
+        </w:rPr>
+      </w:pPr>
+      <w:r>
+        <w:rPr>
+          <w:rFonts w:ascii="Arial" w:hAnsi="Arial"/>
+          <w:color w:val="BFBFBF" w:themeColor="background1" w:themeShade="BF"/>
+        </w:rPr>
+        <w:t>“doors” (DRS)</w:t>
+      </w:r>
+    </w:p>
+    <w:p>
+      <w:pPr>
+        <w:pStyle w:val="ListParagraph"/>
+        <w:numPr>
+          <w:ilvl w:val="2"/>
+          <w:numId w:val="1"/>
+        </w:numPr>
+        <w:spacing w:line="259" w:lineRule="auto"/>
+        <w:rPr>
+          <w:rFonts w:ascii="Arial" w:hAnsi="Arial"/>
+          <w:color w:val="BFBFBF" w:themeColor="background1" w:themeShade="BF"/>
+        </w:rPr>
+      </w:pPr>
+      <w:r>
+        <w:rPr>
+          <w:rFonts w:ascii="Arial" w:hAnsi="Arial"/>
+          <w:color w:val="BFBFBF" w:themeColor="background1" w:themeShade="BF"/>
+        </w:rPr>
+        <w:t>A l’origen, destí o transbord 0</w:t>
+      </w:r>
+    </w:p>
+    <w:p>
+      <w:pPr>
+        <w:pStyle w:val="ListParagraph"/>
+        <w:numPr>
+          <w:ilvl w:val="2"/>
+          <w:numId w:val="1"/>
+        </w:numPr>
+        <w:spacing w:line="259" w:lineRule="auto"/>
+        <w:rPr>
+          <w:rFonts w:ascii="Arial" w:hAnsi="Arial"/>
+          <w:color w:val="BFBFBF" w:themeColor="background1" w:themeShade="BF"/>
+        </w:rPr>
+      </w:pPr>
+      <w:r>
+        <w:rPr>
+          <w:rFonts w:ascii="Arial" w:hAnsi="Arial"/>
+          <w:color w:val="BFBFBF" w:themeColor="background1" w:themeShade="BF"/>
+        </w:rPr>
+        <w:t>Als altres, calcular mitjana per aquell tram en concret i aquella direcció</w:t>
+      </w:r>
+    </w:p>
+    <w:p>
+      <w:pPr>
+        <w:pStyle w:val="ListParagraph"/>
+        <w:numPr>
+          <w:ilvl w:val="2"/>
+          <w:numId w:val="1"/>
+        </w:numPr>
+        <w:spacing w:line="259" w:lineRule="auto"/>
+        <w:rPr>
+          <w:rFonts w:ascii="Arial" w:hAnsi="Arial"/>
+          <w:color w:val="BFBFBF" w:themeColor="background1" w:themeShade="BF"/>
+        </w:rPr>
+      </w:pPr>
+      <w:r>
+        <w:rPr>
+          <w:rFonts w:ascii="Arial" w:hAnsi="Arial"/>
+          <w:color w:val="BFBFBF" w:themeColor="background1" w:themeShade="BF"/>
+        </w:rPr>
+        <w:t>Als extrems de línies, 0</w:t>
+      </w:r>
+    </w:p>
+    <w:p>
+      <w:pPr>
+        <w:pStyle w:val="ListParagraph"/>
+        <w:numPr>
+          <w:ilvl w:val="1"/>
+          <w:numId w:val="1"/>
+        </w:numPr>
+        <w:spacing w:line="259" w:lineRule="auto"/>
+        <w:rPr>
+          <w:rFonts w:ascii="Arial" w:hAnsi="Arial"/>
+          <w:color w:val="BFBFBF" w:themeColor="background1" w:themeShade="BF"/>
+        </w:rPr>
+      </w:pPr>
+      <w:r>
+        <w:rPr>
+          <w:rFonts w:ascii="Arial" w:hAnsi="Arial"/>
+          <w:color w:val="BFBFBF" w:themeColor="background1" w:themeShade="BF"/>
+        </w:rPr>
+        <w:t>“waiting” (WT)</w:t>
+      </w:r>
+    </w:p>
+    <w:p>
+      <w:pPr>
+        <w:pStyle w:val="ListParagraph"/>
+        <w:numPr>
+          <w:ilvl w:val="2"/>
+          <w:numId w:val="1"/>
+        </w:numPr>
+        <w:spacing w:line="259" w:lineRule="auto"/>
+        <w:rPr>
+          <w:rFonts w:ascii="Arial" w:hAnsi="Arial"/>
+          <w:color w:val="BFBFBF" w:themeColor="background1" w:themeShade="BF"/>
+        </w:rPr>
+      </w:pPr>
+      <w:r>
+        <w:rPr>
+          <w:rFonts w:ascii="Arial" w:hAnsi="Arial"/>
+          <w:color w:val="BFBFBF" w:themeColor="background1" w:themeShade="BF"/>
+        </w:rPr>
+        <w:t xml:space="preserve">15s en els trams compartits? (Mínim de pathway) </w:t>
+      </w:r>
+      <w:r>
+        <w:rPr>
+          <w:rFonts w:ascii="Arial" w:hAnsi="Arial"/>
+          <w:color w:val="BFBFBF" w:themeColor="background1" w:themeShade="BF"/>
+        </w:rPr>
+        <w:sym w:font="Wingdings" w:char="F0E0"/>
+      </w:r>
+      <w:r>
+        <w:rPr>
+          <w:rFonts w:ascii="Arial" w:hAnsi="Arial"/>
+          <w:color w:val="BFBFBF" w:themeColor="background1" w:themeShade="BF"/>
+        </w:rPr>
+        <w:t xml:space="preserve"> es transforma en PW?</w:t>
+      </w:r>
+    </w:p>
+    <w:p>
+      <w:pPr>
+        <w:rPr>
+          <w:rFonts w:ascii="Arial" w:hAnsi="Arial" w:cs="Arial"/>
+        </w:rPr>
+      </w:pPr>
     </w:p>
     <w:p>
       <w:pPr>
@@ -634,19 +939,7 @@
         <w:rPr>
           <w:rFonts w:ascii="Arial" w:hAnsi="Arial" w:cs="Arial"/>
         </w:rPr>
-        <w:t xml:space="preserve">Suposem que el tram </w:t>
-      </w:r>
-      <w:r>
-        <w:rPr>
-          <w:rFonts w:ascii="Arial" w:hAnsi="Arial" w:cs="Arial"/>
-        </w:rPr>
-        <w:t xml:space="preserve">i-èssim de metro passa per m_i parades, amb i a {1, …, n}. </w:t>
-      </w:r>
-      <w:r>
-        <w:rPr>
-          <w:rFonts w:ascii="Arial" w:hAnsi="Arial" w:cs="Arial"/>
-        </w:rPr>
-        <w:t>Suposem E_0 i E_f l’entrada inicial i final, respectivament.</w:t>
+        <w:t>Suposem que el tram i-èssim de metro passa per m_i parades, amb i a {1, …, n}. Suposem E_0 i E_f l’entrada inicial i final, respectivament.</w:t>
       </w:r>
     </w:p>
     <w:p>
@@ -797,19 +1090,7 @@
         <w:rPr>
           <w:rFonts w:ascii="Arial" w:hAnsi="Arial" w:cs="Arial"/>
         </w:rPr>
-        <w:t xml:space="preserve">n-1 </w:t>
-      </w:r>
-      <w:r>
-        <w:rPr>
-          <w:rFonts w:ascii="Arial" w:hAnsi="Arial" w:cs="Arial"/>
-        </w:rPr>
-        <w:t>PW_{andana – andana}</w:t>
-      </w:r>
-      <w:r>
-        <w:rPr>
-          <w:rFonts w:ascii="Arial" w:hAnsi="Arial" w:cs="Arial"/>
-        </w:rPr>
-        <w:t xml:space="preserve"> (transbords)</w:t>
+        <w:t>n-1 PW_{andana – andana} (transbords)</w:t>
       </w:r>
     </w:p>
     <w:p>
@@ -863,61 +1144,14 @@
         <w:rPr>
           <w:rFonts w:ascii="Arial" w:hAnsi="Arial" w:cs="Arial"/>
         </w:rPr>
-        <w:t>(</w:t>
-      </w:r>
-      <w:r>
-        <w:rPr>
-          <w:rFonts w:ascii="Arial" w:hAnsi="Arial" w:cs="Arial"/>
-        </w:rPr>
-        <w:t xml:space="preserve">L’entrada inicial està assignada a l’andana indicada i l’entrada final </w:t>
-      </w:r>
-      <w:r>
-        <w:rPr>
-          <w:rFonts w:ascii="Arial" w:hAnsi="Arial" w:cs="Arial"/>
-        </w:rPr>
-        <w:t xml:space="preserve">NO </w:t>
-      </w:r>
-      <w:r>
-        <w:rPr>
-          <w:rFonts w:ascii="Arial" w:hAnsi="Arial" w:cs="Arial"/>
-        </w:rPr>
-        <w:t>està assignada a l’andana indicada</w:t>
-      </w:r>
-      <w:r>
-        <w:rPr>
-          <w:rFonts w:ascii="Arial" w:hAnsi="Arial" w:cs="Arial"/>
-        </w:rPr>
-        <w:t>) o si (l</w:t>
-      </w:r>
-      <w:r>
-        <w:rPr>
-          <w:rFonts w:ascii="Arial" w:hAnsi="Arial" w:cs="Arial"/>
-        </w:rPr>
-        <w:t>’entrada inicial</w:t>
-      </w:r>
-      <w:r>
-        <w:rPr>
-          <w:rFonts w:ascii="Arial" w:hAnsi="Arial" w:cs="Arial"/>
-        </w:rPr>
-        <w:t xml:space="preserve"> NO</w:t>
-      </w:r>
-      <w:r>
-        <w:rPr>
-          <w:rFonts w:ascii="Arial" w:hAnsi="Arial" w:cs="Arial"/>
-        </w:rPr>
-        <w:t xml:space="preserve"> està assignada a l’andana indicada i l’entrada final </w:t>
-      </w:r>
-      <w:r>
-        <w:rPr>
-          <w:rFonts w:ascii="Arial" w:hAnsi="Arial" w:cs="Arial"/>
-        </w:rPr>
-        <w:t xml:space="preserve">sí </w:t>
-      </w:r>
-      <w:r>
-        <w:rPr>
-          <w:rFonts w:ascii="Arial" w:hAnsi="Arial" w:cs="Arial"/>
-        </w:rPr>
-        <w:t>està assignada a l’andana indicada</w:t>
+        <w:t xml:space="preserve">(L’entrada inicial està assignada a l’andana indicada i l’entrada final NO està assignada a l’andana indicada) o si (l’entrada </w:t>
+      </w:r>
+      <w:r>
+        <w:rPr>
+          <w:rFonts w:ascii="Arial" w:hAnsi="Arial" w:cs="Arial"/>
+        </w:rPr>
+        <w:lastRenderedPageBreak/>
+        <w:t>inicial NO està assignada a l’andana indicada i l’entrada final sí està assignada a l’andana indicada</w:t>
       </w:r>
     </w:p>
     <w:p>
@@ -986,7 +1220,7 @@
 </file>
 
 <file path=word/numbering.xml><?xml version="1.0" encoding="utf-8"?>
-<w:numbering xmlns:wpc="http://schemas.microsoft.com/office/word/2010/wordprocessingCanvas" xmlns:cx="http://schemas.microsoft.com/office/drawing/2014/chartex" xmlns:cx1="http://schemas.microsoft.com/office/drawing/2015/9/8/chartex" xmlns:cx2="http://schemas.microsoft.com/office/drawing/2015/10/21/chartex" xmlns:cx3="http://schemas.microsoft.com/office/drawing/2016/5/9/chartex" xmlns:cx4="http://schemas.microsoft.com/office/drawing/2016/5/10/chartex" xmlns:cx5="http://schemas.microsoft.com/office/drawing/2016/5/11/chartex" xmlns:cx6="http://schemas.microsoft.com/office/drawing/2016/5/12/chartex" xmlns:cx7="http://schemas.microsoft.com/office/drawing/2016/5/13/chartex" xmlns:cx8="http://schemas.microsoft.com/office/drawing/2016/5/14/chartex" xmlns:mc="http://schemas.openxmlformats.org/markup-compatibility/2006" xmlns:aink="http://schemas.microsoft.com/office/drawing/2016/ink" xmlns:am3d="http://schemas.microsoft.com/office/drawing/2017/model3d" xmlns:o="urn:schemas-microsoft-com:office:office" xmlns:oel="http://schemas.microsoft.com/office/2019/extlst" xmlns:r="http://schemas.openxmlformats.org/officeDocument/2006/relationships" xmlns:m="http://schemas.openxmlformats.org/officeDocument/2006/math" xmlns:v="urn:schemas-microsoft-com:vml" xmlns:wp14="http://schemas.microsoft.com/office/word/2010/wordprocessingDrawing" xmlns:wp="http://schemas.openxmlformats.org/drawingml/2006/wordprocessingDrawing" xmlns:w10="urn:schemas-microsoft-com:office:word" xmlns:w="http://schemas.openxmlformats.org/wordprocessingml/2006/main" xmlns:w14="http://schemas.microsoft.com/office/word/2010/wordml" xmlns:w15="http://schemas.microsoft.com/office/word/2012/wordml" xmlns:w16cex="http://schemas.microsoft.com/office/word/2018/wordml/cex" xmlns:w16cid="http://schemas.microsoft.com/office/word/2016/wordml/cid" xmlns:w16="http://schemas.microsoft.com/office/word/2018/wordml" xmlns:w16du="http://schemas.microsoft.com/office/word/2023/wordml/word16du" xmlns:w16sdtdh="http://schemas.microsoft.com/office/word/2020/wordml/sdtdatahash" xmlns:w16sdtfl="http://schemas.microsoft.com/office/word/2024/wordml/sdtformatlock" xmlns:w16se="http://schemas.microsoft.com/office/word/2015/wordml/symex" xmlns:wpg="http://schemas.microsoft.com/office/word/2010/wordprocessingGroup" xmlns:wpi="http://schemas.microsoft.com/office/word/2010/wordprocessingInk" xmlns:wne="http://schemas.microsoft.com/office/word/2006/wordml" xmlns:wps="http://schemas.microsoft.com/office/word/2010/wordprocessingShape" mc:Ignorable="w14 w15 w16se w16cid w16 w16cex w16sdtdh w16sdtfl w16du wp14">
+<w:numbering xmlns:wpc="http://schemas.microsoft.com/office/word/2010/wordprocessingCanvas" xmlns:cx="http://schemas.microsoft.com/office/drawing/2014/chartex" xmlns:cx1="http://schemas.microsoft.com/office/drawing/2015/9/8/chartex" xmlns:cx2="http://schemas.microsoft.com/office/drawing/2015/10/21/chartex" xmlns:cx3="http://schemas.microsoft.com/office/drawing/2016/5/9/chartex" xmlns:cx4="http://schemas.microsoft.com/office/drawing/2016/5/10/chartex" xmlns:cx5="http://schemas.microsoft.com/office/drawing/2016/5/11/chartex" xmlns:cx6="http://schemas.microsoft.com/office/drawing/2016/5/12/chartex" xmlns:cx7="http://schemas.microsoft.com/office/drawing/2016/5/13/chartex" xmlns:cx8="http://schemas.microsoft.com/office/drawing/2016/5/14/chartex" xmlns:mc="http://schemas.openxmlformats.org/markup-compatibility/2006" xmlns:m="http://schemas.openxmlformats.org/officeDocument/2006/math" xmlns:aink="http://schemas.microsoft.com/office/drawing/2016/ink" xmlns:am3d="http://schemas.microsoft.com/office/drawing/2017/model3d" xmlns:oel="http://schemas.microsoft.com/office/2019/extlst" xmlns:r="http://schemas.openxmlformats.org/officeDocument/2006/relationships" xmlns:wp14="http://schemas.microsoft.com/office/word/2010/wordprocessingDrawing" xmlns:wp="http://schemas.openxmlformats.org/drawingml/2006/wordprocessingDrawing" xmlns:wpg="http://schemas.microsoft.com/office/word/2010/wordprocessingGroup" xmlns:wpi="http://schemas.microsoft.com/office/word/2010/wordprocessingInk" xmlns:wps="http://schemas.microsoft.com/office/word/2010/wordprocessingShape" xmlns:o="urn:schemas-microsoft-com:office:office" xmlns:v="urn:schemas-microsoft-com:vml" xmlns:w10="urn:schemas-microsoft-com:office:word" xmlns:w="http://schemas.openxmlformats.org/wordprocessingml/2006/main" xmlns:w14="http://schemas.microsoft.com/office/word/2010/wordml" xmlns:w15="http://schemas.microsoft.com/office/word/2012/wordml" xmlns:w16cex="http://schemas.microsoft.com/office/word/2018/wordml/cex" xmlns:w16cid="http://schemas.microsoft.com/office/word/2016/wordml/cid" xmlns:w16="http://schemas.microsoft.com/office/word/2018/wordml" xmlns:w16sdtdh="http://schemas.microsoft.com/office/word/2020/wordml/sdtdatahash" xmlns:w16sdtfl="http://schemas.microsoft.com/office/word/2024/wordml/sdtformatlock" xmlns:w16se="http://schemas.microsoft.com/office/word/2015/wordml/symex" xmlns:w16du="http://schemas.microsoft.com/office/word/2023/wordml/word16du" xmlns:wne="http://schemas.microsoft.com/office/word/2006/wordml" mc:Ignorable="w14 w15 w16se w16cid w16 w16cex w16sdtdh w16sdtfl w16du wp14">
   <w:abstractNum w:abstractNumId="0" w15:restartNumberingAfterBreak="0">
     <w:nsid w:val="1A37573F"/>
     <w:multiLevelType w:val="hybridMultilevel"/>
@@ -1566,7 +1800,7 @@
 </file>
 
 <file path=word/styles.xml><?xml version="1.0" encoding="utf-8"?>
-<w:styles xmlns:mc="http://schemas.openxmlformats.org/markup-compatibility/2006" xmlns:r="http://schemas.openxmlformats.org/officeDocument/2006/relationships" xmlns:w="http://schemas.openxmlformats.org/wordprocessingml/2006/main" xmlns:w14="http://schemas.microsoft.com/office/word/2010/wordml" xmlns:w15="http://schemas.microsoft.com/office/word/2012/wordml" xmlns:w16cex="http://schemas.microsoft.com/office/word/2018/wordml/cex" xmlns:w16cid="http://schemas.microsoft.com/office/word/2016/wordml/cid" xmlns:w16="http://schemas.microsoft.com/office/word/2018/wordml" xmlns:w16du="http://schemas.microsoft.com/office/word/2023/wordml/word16du" xmlns:w16sdtdh="http://schemas.microsoft.com/office/word/2020/wordml/sdtdatahash" xmlns:w16sdtfl="http://schemas.microsoft.com/office/word/2024/wordml/sdtformatlock" xmlns:w16se="http://schemas.microsoft.com/office/word/2015/wordml/symex" mc:Ignorable="w14 w15 w16se w16cid w16 w16cex w16sdtdh w16sdtfl w16du">
+<w:styles xmlns:mc="http://schemas.openxmlformats.org/markup-compatibility/2006" xmlns:r="http://schemas.openxmlformats.org/officeDocument/2006/relationships" xmlns:w="http://schemas.openxmlformats.org/wordprocessingml/2006/main" xmlns:w14="http://schemas.microsoft.com/office/word/2010/wordml" xmlns:w15="http://schemas.microsoft.com/office/word/2012/wordml" xmlns:w16cex="http://schemas.microsoft.com/office/word/2018/wordml/cex" xmlns:w16cid="http://schemas.microsoft.com/office/word/2016/wordml/cid" xmlns:w16="http://schemas.microsoft.com/office/word/2018/wordml" xmlns:w16sdtdh="http://schemas.microsoft.com/office/word/2020/wordml/sdtdatahash" xmlns:w16sdtfl="http://schemas.microsoft.com/office/word/2024/wordml/sdtformatlock" xmlns:w16se="http://schemas.microsoft.com/office/word/2015/wordml/symex" xmlns:w16du="http://schemas.microsoft.com/office/word/2023/wordml/word16du" mc:Ignorable="w14 w15 w16se w16cid w16 w16cex w16sdtdh w16sdtfl w16du">
   <w:docDefaults>
     <w:rPrDefault>
       <w:rPr>

</xml_diff>

<commit_message>
feat(data_validation): validate transfers.txt against pathways and stop relationships
- Add transfers from/to stop_id checks to file_connection_checks.ipynb, verifying they exist in stops
- Replace the one-directional "transfers within pathways" check with a full bidirectional equality check between platform-to-platform pathways and transfers.txt pairs
- Reuse transfers.txt (instead of re-deriving platform-platform pairs from pathways.txt) for the entrance-suggestion neighbor lookup and the same-stop-platform-pairs check in pathways_checks.ipynb
- Add load_transfer_pairs_present and build_platform_graph helpers in gtfs_utils.py; drop the now-redundant platform_graph from build_graph_and_coverage
- Update checks/README.md and WORKFLOW.md to reflect the new transfers-aware checks
- Wrap an over-length print statement to satisfy the check-function-docstrings line-length hook
</commit_message>
<xml_diff>
--- a/.docu/Pesos.docx
+++ b/.docu/Pesos.docx
@@ -36,7 +36,55 @@
         <w:rPr>
           <w:rFonts w:ascii="Arial" w:hAnsi="Arial" w:cs="Arial"/>
         </w:rPr>
-        <w:t xml:space="preserve">el temps que es camina, </w:t>
+        <w:t xml:space="preserve">el temps que es camina </w:t>
+      </w:r>
+    </w:p>
+    <w:p>
+      <w:pPr>
+        <w:pStyle w:val="ListParagraph"/>
+        <w:numPr>
+          <w:ilvl w:val="0"/>
+          <w:numId w:val="7"/>
+        </w:numPr>
+        <w:rPr>
+          <w:rFonts w:ascii="Arial" w:hAnsi="Arial" w:cs="Arial"/>
+        </w:rPr>
+      </w:pPr>
+      <w:r>
+        <w:rPr>
+          <w:rFonts w:ascii="Arial" w:hAnsi="Arial" w:cs="Arial"/>
+        </w:rPr>
+        <w:t>d’una entrada a una andana (o a l’inrevès), o</w:t>
+      </w:r>
+    </w:p>
+    <w:p>
+      <w:pPr>
+        <w:pStyle w:val="ListParagraph"/>
+        <w:numPr>
+          <w:ilvl w:val="0"/>
+          <w:numId w:val="7"/>
+        </w:numPr>
+        <w:rPr>
+          <w:rFonts w:ascii="Arial" w:hAnsi="Arial" w:cs="Arial"/>
+        </w:rPr>
+      </w:pPr>
+      <w:r>
+        <w:rPr>
+          <w:rFonts w:ascii="Arial" w:hAnsi="Arial" w:cs="Arial"/>
+        </w:rPr>
+        <w:t>d’una andana a una andana</w:t>
+      </w:r>
+      <w:r>
+        <w:rPr>
+          <w:rFonts w:ascii="Arial" w:hAnsi="Arial" w:cs="Arial"/>
+        </w:rPr>
+        <w:t xml:space="preserve"> (transbord)</w:t>
+      </w:r>
+      <w:r>
+        <w:rPr>
+          <w:rFonts w:ascii="Arial" w:hAnsi="Arial" w:cs="Arial"/>
+        </w:rPr>
+        <w:t>,</w:t>
       </w:r>
     </w:p>
     <w:p>
@@ -170,6 +218,18 @@
         </w:rPr>
         <w:t xml:space="preserve">l temps que camines </w:t>
       </w:r>
+      <w:r>
+        <w:rPr>
+          <w:rFonts w:ascii="Arial" w:hAnsi="Arial" w:cs="Arial"/>
+        </w:rPr>
+        <w:t>d’una entrada (d’origen o de destí) a una andana i viceversa</w:t>
+      </w:r>
+      <w:r>
+        <w:rPr>
+          <w:rFonts w:ascii="Arial" w:hAnsi="Arial" w:cs="Arial"/>
+        </w:rPr>
+        <w:t>.</w:t>
+      </w:r>
     </w:p>
     <w:p>
       <w:pPr>
@@ -178,15 +238,32 @@
           <w:ilvl w:val="1"/>
           <w:numId w:val="1"/>
         </w:numPr>
-        <w:rPr>
-          <w:rFonts w:ascii="Arial" w:hAnsi="Arial" w:cs="Arial"/>
-        </w:rPr>
-      </w:pPr>
-      <w:r>
-        <w:rPr>
-          <w:rFonts w:ascii="Arial" w:hAnsi="Arial" w:cs="Arial"/>
-        </w:rPr>
-        <w:t xml:space="preserve">d’una entrada (d’origen o de destí) a una andana, i viceversa, o </w:t>
+        <w:jc w:val="right"/>
+        <w:rPr>
+          <w:rFonts w:ascii="Arial" w:hAnsi="Arial" w:cs="Arial"/>
+          <w:color w:val="BFBFBF" w:themeColor="background1" w:themeShade="BF"/>
+        </w:rPr>
+      </w:pPr>
+      <w:r>
+        <w:rPr>
+          <w:rFonts w:ascii="Arial" w:hAnsi="Arial" w:cs="Arial"/>
+          <w:color w:val="BFBFBF" w:themeColor="background1" w:themeShade="BF"/>
+        </w:rPr>
+        <w:t xml:space="preserve">Entrada </w:t>
+      </w:r>
+      <w:r>
+        <w:rPr>
+          <w:rFonts w:ascii="Arial" w:hAnsi="Arial" w:cs="Arial"/>
+          <w:color w:val="BFBFBF" w:themeColor="background1" w:themeShade="BF"/>
+        </w:rPr>
+        <w:sym w:font="Symbol" w:char="F0AB"/>
+      </w:r>
+      <w:r>
+        <w:rPr>
+          <w:rFonts w:ascii="Arial" w:hAnsi="Arial" w:cs="Arial"/>
+          <w:color w:val="BFBFBF" w:themeColor="background1" w:themeShade="BF"/>
+        </w:rPr>
+        <w:t xml:space="preserve"> andana </w:t>
       </w:r>
     </w:p>
     <w:p>
@@ -196,15 +273,318 @@
           <w:ilvl w:val="1"/>
           <w:numId w:val="1"/>
         </w:numPr>
-        <w:rPr>
-          <w:rFonts w:ascii="Arial" w:hAnsi="Arial" w:cs="Arial"/>
-        </w:rPr>
-      </w:pPr>
-      <w:r>
-        <w:rPr>
-          <w:rFonts w:ascii="Arial" w:hAnsi="Arial" w:cs="Arial"/>
-        </w:rPr>
-        <w:t>d’una andana a una altra andana de la mateixa parada (transbord entre línies).</w:t>
+        <w:jc w:val="right"/>
+        <w:rPr>
+          <w:rFonts w:ascii="Arial" w:hAnsi="Arial" w:cs="Arial"/>
+          <w:color w:val="BFBFBF" w:themeColor="background1" w:themeShade="BF"/>
+        </w:rPr>
+      </w:pPr>
+      <w:r>
+        <w:rPr>
+          <w:rFonts w:ascii="Arial" w:hAnsi="Arial" w:cs="Arial"/>
+          <w:color w:val="BFBFBF" w:themeColor="background1" w:themeShade="BF"/>
+        </w:rPr>
+        <w:t xml:space="preserve">Andana </w:t>
+      </w:r>
+      <w:r>
+        <w:rPr>
+          <w:rFonts w:ascii="Arial" w:hAnsi="Arial" w:cs="Arial"/>
+          <w:color w:val="BFBFBF" w:themeColor="background1" w:themeShade="BF"/>
+        </w:rPr>
+        <w:sym w:font="Symbol" w:char="F0AB"/>
+      </w:r>
+      <w:r>
+        <w:rPr>
+          <w:rFonts w:ascii="Arial" w:hAnsi="Arial" w:cs="Arial"/>
+          <w:color w:val="BFBFBF" w:themeColor="background1" w:themeShade="BF"/>
+        </w:rPr>
+        <w:t xml:space="preserve"> andana </w:t>
+      </w:r>
+      <w:r>
+        <w:rPr>
+          <w:rFonts w:ascii="Arial" w:hAnsi="Arial" w:cs="Arial"/>
+          <w:color w:val="BFBFBF" w:themeColor="background1" w:themeShade="BF"/>
+        </w:rPr>
+        <w:t>(transbord)</w:t>
+      </w:r>
+    </w:p>
+    <w:p>
+      <w:pPr>
+        <w:ind w:left="1080"/>
+        <w:rPr>
+          <w:rFonts w:ascii="Arial" w:hAnsi="Arial" w:cs="Arial"/>
+          <w:color w:val="BFBFBF" w:themeColor="background1" w:themeShade="BF"/>
+        </w:rPr>
+      </w:pPr>
+      <w:r>
+        <w:rPr>
+          <w:rFonts w:ascii="Arial" w:hAnsi="Arial" w:cs="Arial"/>
+        </w:rPr>
+        <w:t>Ve donat per ‘pathways.txt’</w:t>
+      </w:r>
+      <w:r>
+        <w:rPr>
+          <w:rFonts w:ascii="Arial" w:hAnsi="Arial" w:cs="Arial"/>
+        </w:rPr>
+        <w:t xml:space="preserve">. </w:t>
+      </w:r>
+    </w:p>
+    <w:p>
+      <w:pPr>
+        <w:ind w:left="1080"/>
+        <w:rPr>
+          <w:rFonts w:ascii="Arial" w:hAnsi="Arial" w:cs="Arial"/>
+        </w:rPr>
+      </w:pPr>
+      <w:r>
+        <w:rPr>
+          <w:rFonts w:ascii="Arial" w:hAnsi="Arial" w:cs="Arial"/>
+        </w:rPr>
+        <w:t>És igual que l’a</w:t>
+      </w:r>
+      <w:r>
+        <w:rPr>
+          <w:rFonts w:ascii="Arial" w:hAnsi="Arial" w:cs="Arial"/>
+        </w:rPr>
+        <w:t>.1</w:t>
+      </w:r>
+      <w:r>
+        <w:rPr>
+          <w:rFonts w:ascii="Arial" w:hAnsi="Arial" w:cs="Arial"/>
+        </w:rPr>
+        <w:t>).</w:t>
+      </w:r>
+    </w:p>
+    <w:p>
+      <w:pPr>
+        <w:pStyle w:val="ListParagraph"/>
+        <w:numPr>
+          <w:ilvl w:val="0"/>
+          <w:numId w:val="1"/>
+        </w:numPr>
+        <w:rPr>
+          <w:rFonts w:ascii="Arial" w:hAnsi="Arial" w:cs="Arial"/>
+        </w:rPr>
+      </w:pPr>
+      <w:r>
+        <w:rPr>
+          <w:rFonts w:ascii="Arial" w:hAnsi="Arial" w:cs="Arial"/>
+          <w:b/>
+          <w:bCs/>
+        </w:rPr>
+        <w:t>Transfer</w:t>
+      </w:r>
+      <w:r>
+        <w:rPr>
+          <w:rFonts w:ascii="Arial" w:hAnsi="Arial" w:cs="Arial"/>
+        </w:rPr>
+        <w:t xml:space="preserve"> (</w:t>
+      </w:r>
+      <w:r>
+        <w:rPr>
+          <w:rFonts w:ascii="Arial" w:hAnsi="Arial" w:cs="Arial"/>
+          <w:b/>
+          <w:bCs/>
+        </w:rPr>
+        <w:t>TF</w:t>
+      </w:r>
+      <w:r>
+        <w:rPr>
+          <w:rFonts w:ascii="Arial" w:hAnsi="Arial" w:cs="Arial"/>
+        </w:rPr>
+        <w:t xml:space="preserve">): </w:t>
+      </w:r>
+      <w:r>
+        <w:rPr>
+          <w:rFonts w:ascii="Arial" w:hAnsi="Arial" w:cs="Arial"/>
+        </w:rPr>
+        <w:t>e</w:t>
+      </w:r>
+      <w:r>
+        <w:rPr>
+          <w:rFonts w:ascii="Arial" w:hAnsi="Arial" w:cs="Arial"/>
+        </w:rPr>
+        <w:t>l temps que camines</w:t>
+      </w:r>
+      <w:r>
+        <w:rPr>
+          <w:rFonts w:ascii="Arial" w:hAnsi="Arial" w:cs="Arial"/>
+        </w:rPr>
+        <w:t xml:space="preserve"> </w:t>
+      </w:r>
+      <w:r>
+        <w:rPr>
+          <w:rFonts w:ascii="Arial" w:hAnsi="Arial" w:cs="Arial"/>
+        </w:rPr>
+        <w:t>d’una andana a una altra andana de la mateixa parada (transbord entre línies)</w:t>
+      </w:r>
+      <w:r>
+        <w:rPr>
+          <w:rFonts w:ascii="Arial" w:hAnsi="Arial" w:cs="Arial"/>
+        </w:rPr>
+        <w:t>.</w:t>
+      </w:r>
+    </w:p>
+    <w:p>
+      <w:pPr>
+        <w:pStyle w:val="ListParagraph"/>
+        <w:rPr>
+          <w:rFonts w:ascii="Arial" w:hAnsi="Arial" w:cs="Arial"/>
+        </w:rPr>
+      </w:pPr>
+      <w:r>
+        <w:rPr>
+          <w:rFonts w:ascii="Arial" w:hAnsi="Arial" w:cs="Arial"/>
+        </w:rPr>
+        <w:t>Ve donat per ‘transfers.txt’.</w:t>
+      </w:r>
+    </w:p>
+    <w:p>
+      <w:pPr>
+        <w:pStyle w:val="ListParagraph"/>
+        <w:rPr>
+          <w:rFonts w:ascii="Arial" w:hAnsi="Arial" w:cs="Arial"/>
+        </w:rPr>
+      </w:pPr>
+      <w:r>
+        <w:rPr>
+          <w:rFonts w:ascii="Arial" w:hAnsi="Arial" w:cs="Arial"/>
+        </w:rPr>
+        <w:t>És igual que l’a.2).</w:t>
+      </w:r>
+    </w:p>
+    <w:p>
+      <w:pPr>
+        <w:pStyle w:val="ListParagraph"/>
+        <w:rPr>
+          <w:rFonts w:ascii="Arial" w:hAnsi="Arial" w:cs="Arial"/>
+        </w:rPr>
+      </w:pPr>
+    </w:p>
+    <w:p>
+      <w:pPr>
+        <w:pStyle w:val="ListParagraph"/>
+        <w:rPr>
+          <w:rFonts w:ascii="Arial" w:hAnsi="Arial" w:cs="Arial"/>
+        </w:rPr>
+      </w:pPr>
+    </w:p>
+    <w:p>
+      <w:pPr>
+        <w:pStyle w:val="ListParagraph"/>
+        <w:numPr>
+          <w:ilvl w:val="0"/>
+          <w:numId w:val="1"/>
+        </w:numPr>
+        <w:rPr>
+          <w:rFonts w:ascii="Arial" w:hAnsi="Arial" w:cs="Arial"/>
+        </w:rPr>
+      </w:pPr>
+      <w:r>
+        <w:rPr>
+          <w:rFonts w:ascii="Arial" w:hAnsi="Arial" w:cs="Arial"/>
+          <w:b/>
+          <w:bCs/>
+        </w:rPr>
+        <w:t>Subway</w:t>
+      </w:r>
+      <w:r>
+        <w:rPr>
+          <w:rFonts w:ascii="Arial" w:hAnsi="Arial" w:cs="Arial"/>
+        </w:rPr>
+        <w:t xml:space="preserve"> (</w:t>
+      </w:r>
+      <w:r>
+        <w:rPr>
+          <w:rFonts w:ascii="Arial" w:hAnsi="Arial" w:cs="Arial"/>
+          <w:b/>
+          <w:bCs/>
+        </w:rPr>
+        <w:t>SW</w:t>
+      </w:r>
+      <w:r>
+        <w:rPr>
+          <w:rFonts w:ascii="Arial" w:hAnsi="Arial" w:cs="Arial"/>
+        </w:rPr>
+        <w:t xml:space="preserve">): el temps </w:t>
+      </w:r>
+      <w:r>
+        <w:rPr>
+          <w:rFonts w:ascii="Arial" w:hAnsi="Arial" w:cs="Arial"/>
+        </w:rPr>
+        <w:t>entre que arriba el metro a una parada i arriba a la següent (arrival_b – arrival_a)</w:t>
+      </w:r>
+    </w:p>
+    <w:p>
+      <w:pPr>
+        <w:pStyle w:val="ListParagraph"/>
+        <w:rPr>
+          <w:rFonts w:ascii="Arial" w:hAnsi="Arial" w:cs="Arial"/>
+        </w:rPr>
+      </w:pPr>
+      <w:r>
+        <w:rPr>
+          <w:rFonts w:ascii="Arial" w:hAnsi="Arial" w:cs="Arial"/>
+        </w:rPr>
+        <w:t>Ho calculem nosaltres i ve donat a ‘</w:t>
+      </w:r>
+      <w:r>
+        <w:rPr>
+          <w:rFonts w:ascii="Arial" w:hAnsi="Arial" w:cs="Arial"/>
+          <w:highlight w:val="yellow"/>
+        </w:rPr>
+        <w:t>fitxer_que_encara_no_s’ha_creat</w:t>
+      </w:r>
+      <w:r>
+        <w:rPr>
+          <w:rFonts w:ascii="Arial" w:hAnsi="Arial" w:cs="Arial"/>
+        </w:rPr>
+        <w:t xml:space="preserve">.txt’. </w:t>
+      </w:r>
+    </w:p>
+    <w:p>
+      <w:pPr>
+        <w:pStyle w:val="ListParagraph"/>
+        <w:rPr>
+          <w:rFonts w:ascii="Arial" w:hAnsi="Arial" w:cs="Arial"/>
+        </w:rPr>
+      </w:pPr>
+      <w:r>
+        <w:rPr>
+          <w:rFonts w:ascii="Arial" w:hAnsi="Arial" w:cs="Arial"/>
+        </w:rPr>
+        <w:t>Inclou b) i c).</w:t>
+      </w:r>
+    </w:p>
+    <w:p>
+      <w:pPr>
+        <w:rPr>
+          <w:rFonts w:ascii="Arial" w:hAnsi="Arial" w:cs="Arial"/>
+        </w:rPr>
+      </w:pPr>
+    </w:p>
+    <w:p>
+      <w:pPr>
+        <w:pStyle w:val="ListParagraph"/>
+        <w:numPr>
+          <w:ilvl w:val="0"/>
+          <w:numId w:val="1"/>
+        </w:numPr>
+        <w:rPr>
+          <w:rFonts w:ascii="Arial" w:hAnsi="Arial" w:cs="Arial"/>
+        </w:rPr>
+      </w:pPr>
+      <w:r>
+        <w:rPr>
+          <w:rFonts w:ascii="Arial" w:hAnsi="Arial" w:cs="Arial"/>
+        </w:rPr>
+        <w:t>Aclaracions</w:t>
+      </w:r>
+      <w:r>
+        <w:rPr>
+          <w:rFonts w:ascii="Arial" w:hAnsi="Arial" w:cs="Arial"/>
+        </w:rPr>
+        <w:t xml:space="preserve">. </w:t>
       </w:r>
     </w:p>
     <w:p>
@@ -214,32 +594,39 @@
           <w:ilvl w:val="1"/>
           <w:numId w:val="1"/>
         </w:numPr>
-        <w:jc w:val="right"/>
-        <w:rPr>
-          <w:rFonts w:ascii="Arial" w:hAnsi="Arial" w:cs="Arial"/>
-          <w:color w:val="BFBFBF" w:themeColor="background1" w:themeShade="BF"/>
-        </w:rPr>
-      </w:pPr>
-      <w:r>
-        <w:rPr>
-          <w:rFonts w:ascii="Arial" w:hAnsi="Arial" w:cs="Arial"/>
-          <w:color w:val="BFBFBF" w:themeColor="background1" w:themeShade="BF"/>
-        </w:rPr>
-        <w:t xml:space="preserve">Entrada </w:t>
-      </w:r>
-      <w:r>
-        <w:rPr>
-          <w:rFonts w:ascii="Arial" w:hAnsi="Arial" w:cs="Arial"/>
-          <w:color w:val="BFBFBF" w:themeColor="background1" w:themeShade="BF"/>
-        </w:rPr>
-        <w:sym w:font="Symbol" w:char="F0AB"/>
-      </w:r>
-      <w:r>
-        <w:rPr>
-          <w:rFonts w:ascii="Arial" w:hAnsi="Arial" w:cs="Arial"/>
-          <w:color w:val="BFBFBF" w:themeColor="background1" w:themeShade="BF"/>
-        </w:rPr>
-        <w:t xml:space="preserve"> andana </w:t>
+        <w:rPr>
+          <w:rFonts w:ascii="Arial" w:hAnsi="Arial" w:cs="Arial"/>
+        </w:rPr>
+      </w:pPr>
+      <w:r>
+        <w:rPr>
+          <w:rFonts w:ascii="Arial" w:hAnsi="Arial" w:cs="Arial"/>
+        </w:rPr>
+        <w:t xml:space="preserve">S’ha inclòs c) dins de SW perquè encara que el Dijkstra i l’A* permeten bucles en un graf (aresta que comença i acaba al mateix vèrtex), mai s’inclouran aquests pesos a la longitud final del camí trobat. </w:t>
+      </w:r>
+      <w:r>
+        <w:rPr>
+          <w:rFonts w:ascii="Arial" w:hAnsi="Arial" w:cs="Arial"/>
+        </w:rPr>
+        <w:t>Com aquest tipus de pes sempre està present en un viatge, i</w:t>
+      </w:r>
+      <w:r>
+        <w:rPr>
+          <w:rFonts w:ascii="Arial" w:hAnsi="Arial" w:cs="Arial"/>
+        </w:rPr>
+        <w:t>ncloure’l aquí ha sigut la manera més senzilla que s’ha trobat</w:t>
+      </w:r>
+      <w:r>
+        <w:rPr>
+          <w:rFonts w:ascii="Arial" w:hAnsi="Arial" w:cs="Arial"/>
+        </w:rPr>
+        <w:t xml:space="preserve"> per tal d’assegurar-nos que els algoritmes el consideraran en el temps final</w:t>
+      </w:r>
+      <w:r>
+        <w:rPr>
+          <w:rFonts w:ascii="Arial" w:hAnsi="Arial" w:cs="Arial"/>
+        </w:rPr>
+        <w:t>.</w:t>
       </w:r>
     </w:p>
     <w:p>
@@ -249,191 +636,89 @@
           <w:ilvl w:val="1"/>
           <w:numId w:val="1"/>
         </w:numPr>
-        <w:jc w:val="right"/>
-        <w:rPr>
-          <w:rFonts w:ascii="Arial" w:hAnsi="Arial" w:cs="Arial"/>
-          <w:color w:val="BFBFBF" w:themeColor="background1" w:themeShade="BF"/>
-        </w:rPr>
-      </w:pPr>
-      <w:r>
-        <w:rPr>
-          <w:rFonts w:ascii="Arial" w:hAnsi="Arial" w:cs="Arial"/>
-          <w:color w:val="BFBFBF" w:themeColor="background1" w:themeShade="BF"/>
-        </w:rPr>
-        <w:t xml:space="preserve">Andana </w:t>
-      </w:r>
-      <w:r>
-        <w:rPr>
-          <w:rFonts w:ascii="Arial" w:hAnsi="Arial" w:cs="Arial"/>
-          <w:color w:val="BFBFBF" w:themeColor="background1" w:themeShade="BF"/>
-        </w:rPr>
-        <w:sym w:font="Symbol" w:char="F0AB"/>
-      </w:r>
-      <w:r>
-        <w:rPr>
-          <w:rFonts w:ascii="Arial" w:hAnsi="Arial" w:cs="Arial"/>
-          <w:color w:val="BFBFBF" w:themeColor="background1" w:themeShade="BF"/>
-        </w:rPr>
-        <w:t xml:space="preserve"> andana </w:t>
-      </w:r>
-      <w:r>
-        <w:rPr>
-          <w:rFonts w:ascii="Arial" w:hAnsi="Arial" w:cs="Arial"/>
-          <w:color w:val="BFBFBF" w:themeColor="background1" w:themeShade="BF"/>
-        </w:rPr>
-        <w:t>(transbord)</w:t>
-      </w:r>
-    </w:p>
-    <w:p>
-      <w:pPr>
-        <w:ind w:left="1080"/>
-        <w:rPr>
-          <w:rFonts w:ascii="Arial" w:hAnsi="Arial" w:cs="Arial"/>
-        </w:rPr>
-      </w:pPr>
-      <w:r>
-        <w:rPr>
-          <w:rFonts w:ascii="Arial" w:hAnsi="Arial" w:cs="Arial"/>
-        </w:rPr>
-        <w:t>Ve donat per ‘pathways.txt’</w:t>
-      </w:r>
-      <w:r>
-        <w:rPr>
-          <w:rFonts w:ascii="Arial" w:hAnsi="Arial" w:cs="Arial"/>
-        </w:rPr>
-        <w:t xml:space="preserve">. </w:t>
-      </w:r>
-    </w:p>
-    <w:p>
-      <w:pPr>
-        <w:ind w:left="1080"/>
-        <w:rPr>
-          <w:rFonts w:ascii="Arial" w:hAnsi="Arial" w:cs="Arial"/>
-        </w:rPr>
-      </w:pPr>
-      <w:r>
-        <w:rPr>
-          <w:rFonts w:ascii="Arial" w:hAnsi="Arial" w:cs="Arial"/>
-        </w:rPr>
-        <w:t>És igual que l’a).</w:t>
-      </w:r>
-    </w:p>
-    <w:p>
-      <w:pPr>
-        <w:pStyle w:val="ListParagraph"/>
-        <w:numPr>
-          <w:ilvl w:val="0"/>
-          <w:numId w:val="1"/>
-        </w:numPr>
-        <w:rPr>
-          <w:rFonts w:ascii="Arial" w:hAnsi="Arial" w:cs="Arial"/>
-        </w:rPr>
-      </w:pPr>
-      <w:r>
-        <w:rPr>
-          <w:rFonts w:ascii="Arial" w:hAnsi="Arial" w:cs="Arial"/>
-          <w:b/>
-          <w:bCs/>
-        </w:rPr>
-        <w:t>Subway</w:t>
-      </w:r>
-      <w:r>
-        <w:rPr>
-          <w:rFonts w:ascii="Arial" w:hAnsi="Arial" w:cs="Arial"/>
-        </w:rPr>
-        <w:t xml:space="preserve"> (</w:t>
-      </w:r>
-      <w:r>
-        <w:rPr>
-          <w:rFonts w:ascii="Arial" w:hAnsi="Arial" w:cs="Arial"/>
-          <w:b/>
-          <w:bCs/>
-        </w:rPr>
-        <w:t>SW</w:t>
-      </w:r>
-      <w:r>
-        <w:rPr>
-          <w:rFonts w:ascii="Arial" w:hAnsi="Arial" w:cs="Arial"/>
-        </w:rPr>
-        <w:t xml:space="preserve">): el temps </w:t>
-      </w:r>
-      <w:r>
-        <w:rPr>
-          <w:rFonts w:ascii="Arial" w:hAnsi="Arial" w:cs="Arial"/>
-        </w:rPr>
-        <w:t>entre que arriba el metro a una parada i arriba a la següent (arrival_b – arrival_a)</w:t>
-      </w:r>
-    </w:p>
-    <w:p>
-      <w:pPr>
-        <w:pStyle w:val="ListParagraph"/>
-        <w:rPr>
-          <w:rFonts w:ascii="Arial" w:hAnsi="Arial" w:cs="Arial"/>
-        </w:rPr>
-      </w:pPr>
-      <w:r>
-        <w:rPr>
-          <w:rFonts w:ascii="Arial" w:hAnsi="Arial" w:cs="Arial"/>
-        </w:rPr>
-        <w:t>Ho calculem nosaltres i ve donat a ‘</w:t>
-      </w:r>
-      <w:r>
-        <w:rPr>
-          <w:rFonts w:ascii="Arial" w:hAnsi="Arial" w:cs="Arial"/>
-          <w:highlight w:val="yellow"/>
-        </w:rPr>
-        <w:t>fitxer_que_encara_no_s’ha_creat</w:t>
-      </w:r>
-      <w:r>
-        <w:rPr>
-          <w:rFonts w:ascii="Arial" w:hAnsi="Arial" w:cs="Arial"/>
-        </w:rPr>
-        <w:t xml:space="preserve">.txt’. </w:t>
-      </w:r>
-    </w:p>
-    <w:p>
-      <w:pPr>
-        <w:pStyle w:val="ListParagraph"/>
-        <w:rPr>
-          <w:rFonts w:ascii="Arial" w:hAnsi="Arial" w:cs="Arial"/>
-        </w:rPr>
-      </w:pPr>
-      <w:r>
-        <w:rPr>
-          <w:rFonts w:ascii="Arial" w:hAnsi="Arial" w:cs="Arial"/>
-        </w:rPr>
-        <w:t>Inclou b) i c).</w:t>
-      </w:r>
-    </w:p>
-    <w:p>
-      <w:pPr>
-        <w:rPr>
-          <w:rFonts w:ascii="Arial" w:hAnsi="Arial" w:cs="Arial"/>
-        </w:rPr>
-      </w:pPr>
-    </w:p>
-    <w:p>
-      <w:pPr>
-        <w:pStyle w:val="ListParagraph"/>
-        <w:numPr>
-          <w:ilvl w:val="0"/>
-          <w:numId w:val="1"/>
-        </w:numPr>
-        <w:rPr>
-          <w:rFonts w:ascii="Arial" w:hAnsi="Arial" w:cs="Arial"/>
-        </w:rPr>
-      </w:pPr>
-      <w:r>
-        <w:rPr>
-          <w:rFonts w:ascii="Arial" w:hAnsi="Arial" w:cs="Arial"/>
-        </w:rPr>
-        <w:t>Aclaracions</w:t>
-      </w:r>
-      <w:r>
-        <w:rPr>
-          <w:rFonts w:ascii="Arial" w:hAnsi="Arial" w:cs="Arial"/>
-        </w:rPr>
-        <w:t xml:space="preserve">. </w:t>
+        <w:rPr>
+          <w:rFonts w:ascii="Arial" w:hAnsi="Arial" w:cs="Arial"/>
+        </w:rPr>
+      </w:pPr>
+      <w:r>
+        <w:rPr>
+          <w:rFonts w:ascii="Arial" w:hAnsi="Arial" w:cs="Arial"/>
+        </w:rPr>
+        <w:t xml:space="preserve">Un cas particular de c) és a la primera parada </w:t>
+      </w:r>
+      <w:r>
+        <w:rPr>
+          <w:rFonts w:ascii="Arial" w:hAnsi="Arial" w:cs="Arial"/>
+        </w:rPr>
+        <w:t xml:space="preserve">d’un tram de metro </w:t>
+      </w:r>
+      <w:r>
+        <w:rPr>
+          <w:rFonts w:ascii="Arial" w:hAnsi="Arial" w:cs="Arial"/>
+        </w:rPr>
+        <w:t xml:space="preserve">(ja sigui en un </w:t>
+      </w:r>
+      <w:r>
+        <w:rPr>
+          <w:rFonts w:ascii="Arial" w:hAnsi="Arial" w:cs="Arial"/>
+          <w:lang w:val="ca-ES"/>
+        </w:rPr>
+        <w:t>transbord</w:t>
+      </w:r>
+      <w:r>
+        <w:rPr>
+          <w:rFonts w:ascii="Arial" w:hAnsi="Arial" w:cs="Arial"/>
+        </w:rPr>
+        <w:t xml:space="preserve"> o no). A les hipòtesis hem considerat que no s’ha d’esperar a que arribi el metro. Tanmateix, per tal de simplificar el problema i que els pesos de les arestes</w:t>
+      </w:r>
+      <w:r>
+        <w:rPr>
+          <w:rFonts w:ascii="Arial" w:hAnsi="Arial" w:cs="Arial"/>
+        </w:rPr>
+        <w:t xml:space="preserve"> fossin constants i no depenguessin de si és </w:t>
+      </w:r>
+      <w:r>
+        <w:rPr>
+          <w:rFonts w:ascii="Arial" w:hAnsi="Arial" w:cs="Arial"/>
+        </w:rPr>
+        <w:t xml:space="preserve">un transbord o no, també es considera el temps d’obrir i tancar portes en aquesta parada. </w:t>
+      </w:r>
+      <w:r>
+        <w:rPr>
+          <w:rFonts w:ascii="Arial" w:hAnsi="Arial" w:cs="Arial"/>
+        </w:rPr>
+        <w:t>Cal remarcar</w:t>
+      </w:r>
+      <w:r>
+        <w:rPr>
+          <w:rFonts w:ascii="Arial" w:hAnsi="Arial" w:cs="Arial"/>
+        </w:rPr>
+        <w:t xml:space="preserve"> que</w:t>
+      </w:r>
+      <w:r>
+        <w:rPr>
+          <w:rFonts w:ascii="Arial" w:hAnsi="Arial" w:cs="Arial"/>
+        </w:rPr>
+        <w:t>,</w:t>
+      </w:r>
+      <w:r>
+        <w:rPr>
+          <w:rFonts w:ascii="Arial" w:hAnsi="Arial" w:cs="Arial"/>
+        </w:rPr>
+        <w:t xml:space="preserve"> seguint la </w:t>
+      </w:r>
+      <w:r>
+        <w:rPr>
+          <w:rFonts w:ascii="Arial" w:hAnsi="Arial" w:cs="Arial"/>
+        </w:rPr>
+        <w:lastRenderedPageBreak/>
+        <w:t>definició de SB,</w:t>
+      </w:r>
+      <w:r>
+        <w:rPr>
+          <w:rFonts w:ascii="Arial" w:hAnsi="Arial" w:cs="Arial"/>
+        </w:rPr>
+        <w:t xml:space="preserve"> a l’última (d’un transbord o no) aquest temps no es considera.</w:t>
       </w:r>
     </w:p>
     <w:p>
@@ -451,147 +736,49 @@
         <w:rPr>
           <w:rFonts w:ascii="Arial" w:hAnsi="Arial" w:cs="Arial"/>
         </w:rPr>
-        <w:t xml:space="preserve">S’ha inclòs c) dins de SW perquè encara que el Dijkstra i l’A* permeten bucles en un graf (aresta que comença i acaba al mateix vèrtex), mai s’inclouran aquests pesos a la longitud final del camí trobat. </w:t>
-      </w:r>
-      <w:r>
-        <w:rPr>
-          <w:rFonts w:ascii="Arial" w:hAnsi="Arial" w:cs="Arial"/>
-        </w:rPr>
-        <w:t>Com aquest tipus de pes sempre està present en un viatge, i</w:t>
-      </w:r>
-      <w:r>
-        <w:rPr>
-          <w:rFonts w:ascii="Arial" w:hAnsi="Arial" w:cs="Arial"/>
-        </w:rPr>
-        <w:t>ncloure’l aquí ha sigut la manera més senzilla que s’ha trobat</w:t>
-      </w:r>
-      <w:r>
-        <w:rPr>
-          <w:rFonts w:ascii="Arial" w:hAnsi="Arial" w:cs="Arial"/>
-        </w:rPr>
-        <w:t xml:space="preserve"> per tal d’assegurar-nos que els algoritmes el consideraran en el temps final</w:t>
-      </w:r>
-      <w:r>
-        <w:rPr>
-          <w:rFonts w:ascii="Arial" w:hAnsi="Arial" w:cs="Arial"/>
-        </w:rPr>
-        <w:t>.</w:t>
-      </w:r>
-    </w:p>
-    <w:p>
-      <w:pPr>
-        <w:pStyle w:val="ListParagraph"/>
-        <w:numPr>
-          <w:ilvl w:val="1"/>
-          <w:numId w:val="1"/>
-        </w:numPr>
-        <w:rPr>
-          <w:rFonts w:ascii="Arial" w:hAnsi="Arial" w:cs="Arial"/>
-        </w:rPr>
-      </w:pPr>
-      <w:r>
-        <w:rPr>
-          <w:rFonts w:ascii="Arial" w:hAnsi="Arial" w:cs="Arial"/>
-        </w:rPr>
-        <w:t xml:space="preserve">Un cas particular de c) és a la primera parada </w:t>
-      </w:r>
-      <w:r>
-        <w:rPr>
-          <w:rFonts w:ascii="Arial" w:hAnsi="Arial" w:cs="Arial"/>
-        </w:rPr>
-        <w:t xml:space="preserve">d’un tram de metro </w:t>
-      </w:r>
-      <w:r>
-        <w:rPr>
-          <w:rFonts w:ascii="Arial" w:hAnsi="Arial" w:cs="Arial"/>
-        </w:rPr>
-        <w:t xml:space="preserve">(ja sigui en un </w:t>
-      </w:r>
-      <w:r>
-        <w:rPr>
-          <w:rFonts w:ascii="Arial" w:hAnsi="Arial" w:cs="Arial"/>
-          <w:lang w:val="ca-ES"/>
-        </w:rPr>
-        <w:t>transbord</w:t>
-      </w:r>
-      <w:r>
-        <w:rPr>
-          <w:rFonts w:ascii="Arial" w:hAnsi="Arial" w:cs="Arial"/>
-        </w:rPr>
-        <w:t xml:space="preserve"> o no). A les hipòtesis hem considerat que no s’ha d’esperar a que arribi el metro. Tanmateix, per tal de simplificar el problema i que els pesos de les arestes</w:t>
-      </w:r>
-      <w:r>
-        <w:rPr>
-          <w:rFonts w:ascii="Arial" w:hAnsi="Arial" w:cs="Arial"/>
-        </w:rPr>
-        <w:t xml:space="preserve"> fossin constants i no depenguessin de si és </w:t>
-      </w:r>
-      <w:r>
-        <w:rPr>
-          <w:rFonts w:ascii="Arial" w:hAnsi="Arial" w:cs="Arial"/>
-        </w:rPr>
-        <w:t xml:space="preserve">un transbord o no, també es considera el temps d’obrir i tancar portes en aquesta parada. </w:t>
-      </w:r>
-      <w:r>
-        <w:rPr>
-          <w:rFonts w:ascii="Arial" w:hAnsi="Arial" w:cs="Arial"/>
-        </w:rPr>
-        <w:t>Cal remarcar</w:t>
-      </w:r>
-      <w:r>
-        <w:rPr>
-          <w:rFonts w:ascii="Arial" w:hAnsi="Arial" w:cs="Arial"/>
-        </w:rPr>
-        <w:t xml:space="preserve"> que</w:t>
-      </w:r>
-      <w:r>
-        <w:rPr>
-          <w:rFonts w:ascii="Arial" w:hAnsi="Arial" w:cs="Arial"/>
-        </w:rPr>
-        <w:t>,</w:t>
-      </w:r>
-      <w:r>
-        <w:rPr>
-          <w:rFonts w:ascii="Arial" w:hAnsi="Arial" w:cs="Arial"/>
-        </w:rPr>
-        <w:t xml:space="preserve"> seguint la definició de SB,</w:t>
-      </w:r>
-      <w:r>
-        <w:rPr>
-          <w:rFonts w:ascii="Arial" w:hAnsi="Arial" w:cs="Arial"/>
-        </w:rPr>
-        <w:t xml:space="preserve"> a l’última (d’un transbord o no) aquest temps no es considera.</w:t>
-      </w:r>
-    </w:p>
-    <w:p>
-      <w:pPr>
-        <w:pStyle w:val="ListParagraph"/>
-        <w:numPr>
-          <w:ilvl w:val="1"/>
-          <w:numId w:val="1"/>
-        </w:numPr>
-        <w:rPr>
-          <w:rFonts w:ascii="Arial" w:hAnsi="Arial" w:cs="Arial"/>
-        </w:rPr>
-      </w:pPr>
-      <w:r>
-        <w:rPr>
-          <w:rFonts w:ascii="Arial" w:hAnsi="Arial" w:cs="Arial"/>
-        </w:rPr>
         <w:t>L’únic cas en el què té sentit considerar d) amb les hipòtesis imposades és en el cas de les andanes compartides de la L9 i la L10 quan es baixa del metro d’una línia per agafar un altre metro de l’altra línia. Per tal que aquest canvi no sigui gratuït de fer</w:t>
       </w:r>
       <w:r>
         <w:rPr>
           <w:rFonts w:ascii="Arial" w:hAnsi="Arial" w:cs="Arial"/>
         </w:rPr>
-        <w:t xml:space="preserve">, es posarà que el </w:t>
-      </w:r>
-      <w:r>
-        <w:rPr>
-          <w:rFonts w:ascii="Arial" w:hAnsi="Arial" w:cs="Arial"/>
-        </w:rPr>
-        <w:lastRenderedPageBreak/>
-        <w:t>temps entre baixar-te del metro, que aquest se’n vagi, arribi el nou de l’altra línia i pujar-te siguin 15s perquè és el mínim temps existent a ‘pathways’. Amb la duplicació artifical d’aquestes andanes posarem aquest pes com un PW entre elles.</w:t>
+        <w:t>, es posarà que el temps entre baixar-te del metro, que aquest se’n vagi, arribi el nou de l’altra línia i pujar-te sigui</w:t>
+      </w:r>
+      <w:r>
+        <w:rPr>
+          <w:rFonts w:ascii="Arial" w:hAnsi="Arial" w:cs="Arial"/>
+        </w:rPr>
+        <w:t xml:space="preserve"> el mínim temps a ‘transfers’</w:t>
+      </w:r>
+      <w:r>
+        <w:rPr>
+          <w:rFonts w:ascii="Arial" w:hAnsi="Arial" w:cs="Arial"/>
+        </w:rPr>
+        <w:t xml:space="preserve"> </w:t>
+      </w:r>
+      <w:r>
+        <w:rPr>
+          <w:rFonts w:ascii="Arial" w:hAnsi="Arial" w:cs="Arial"/>
+        </w:rPr>
+        <w:t>(</w:t>
+      </w:r>
+      <w:r>
+        <w:rPr>
+          <w:rFonts w:ascii="Arial" w:hAnsi="Arial" w:cs="Arial"/>
+        </w:rPr>
+        <w:t>15s</w:t>
+      </w:r>
+      <w:r>
+        <w:rPr>
+          <w:rFonts w:ascii="Arial" w:hAnsi="Arial" w:cs="Arial"/>
+        </w:rPr>
+        <w:t>)</w:t>
+      </w:r>
+      <w:r>
+        <w:rPr>
+          <w:rFonts w:ascii="Arial" w:hAnsi="Arial" w:cs="Arial"/>
+        </w:rPr>
+        <w:t>. Amb la duplicació artifical d’aquestes andanes posarem aquest pes com un PW entre elles.</w:t>
       </w:r>
     </w:p>
     <w:p>
@@ -1054,7 +1241,21 @@
         <w:rPr>
           <w:rFonts w:ascii="Arial" w:hAnsi="Arial" w:cs="Arial"/>
         </w:rPr>
-        <w:t>n+1, n+2 o n+3 trams de PW, ja que:</w:t>
+        <w:t xml:space="preserve">n-1, n o n+1 trams de TF, ja que: </w:t>
+      </w:r>
+      <w:r>
+        <w:rPr>
+          <w:rFonts w:ascii="Arial" w:hAnsi="Arial" w:cs="Arial"/>
+          <w:color w:val="808080" w:themeColor="background1" w:themeShade="80"/>
+        </w:rPr>
+        <w:sym w:font="Wingdings" w:char="F0DF"/>
+      </w:r>
+      <w:r>
+        <w:rPr>
+          <w:rFonts w:ascii="Arial" w:hAnsi="Arial" w:cs="Arial"/>
+          <w:color w:val="808080" w:themeColor="background1" w:themeShade="80"/>
+        </w:rPr>
+        <w:t xml:space="preserve"> si dona temps a optimitzar més tard</w:t>
       </w:r>
     </w:p>
     <w:p>
@@ -1072,7 +1273,7 @@
         <w:rPr>
           <w:rFonts w:ascii="Arial" w:hAnsi="Arial" w:cs="Arial"/>
         </w:rPr>
-        <w:t xml:space="preserve">Hi ha 2 PW_{entrada – andana} </w:t>
+        <w:t>Hi ha n-1 TF pels n trams de metro</w:t>
       </w:r>
     </w:p>
     <w:p>
@@ -1090,25 +1291,20 @@
         <w:rPr>
           <w:rFonts w:ascii="Arial" w:hAnsi="Arial" w:cs="Arial"/>
         </w:rPr>
-        <w:t>n-1 PW_{andana – andana} (transbords)</w:t>
-      </w:r>
-    </w:p>
-    <w:p>
-      <w:pPr>
-        <w:pStyle w:val="ListParagraph"/>
-        <w:numPr>
-          <w:ilvl w:val="1"/>
-          <w:numId w:val="1"/>
-        </w:numPr>
-        <w:rPr>
-          <w:rFonts w:ascii="Arial" w:hAnsi="Arial" w:cs="Arial"/>
-        </w:rPr>
-      </w:pPr>
-      <w:r>
-        <w:rPr>
-          <w:rFonts w:ascii="Arial" w:hAnsi="Arial" w:cs="Arial"/>
-        </w:rPr>
-        <w:t>Hi hauran 0, 1 o 2 PW addicionals si</w:t>
+        <w:lastRenderedPageBreak/>
+        <w:t xml:space="preserve">Hi hauran 0, 1 o 2 </w:t>
+      </w:r>
+      <w:r>
+        <w:rPr>
+          <w:rFonts w:ascii="Arial" w:hAnsi="Arial" w:cs="Arial"/>
+        </w:rPr>
+        <w:t>TF</w:t>
+      </w:r>
+      <w:r>
+        <w:rPr>
+          <w:rFonts w:ascii="Arial" w:hAnsi="Arial" w:cs="Arial"/>
+        </w:rPr>
+        <w:t xml:space="preserve"> addicionals si</w:t>
       </w:r>
     </w:p>
     <w:p>
@@ -1144,14 +1340,7 @@
         <w:rPr>
           <w:rFonts w:ascii="Arial" w:hAnsi="Arial" w:cs="Arial"/>
         </w:rPr>
-        <w:t xml:space="preserve">(L’entrada inicial està assignada a l’andana indicada i l’entrada final NO està assignada a l’andana indicada) o si (l’entrada </w:t>
-      </w:r>
-      <w:r>
-        <w:rPr>
-          <w:rFonts w:ascii="Arial" w:hAnsi="Arial" w:cs="Arial"/>
-        </w:rPr>
-        <w:lastRenderedPageBreak/>
-        <w:t>inicial NO està assignada a l’andana indicada i l’entrada final sí està assignada a l’andana indicada</w:t>
+        <w:t>(L’entrada inicial està assignada a l’andana indicada i l’entrada final NO està assignada a l’andana indicada) o si (l’entrada inicial NO està assignada a l’andana indicada i l’entrada final sí està assignada a l’andana indicada</w:t>
       </w:r>
     </w:p>
     <w:p>
@@ -1170,6 +1359,42 @@
           <w:rFonts w:ascii="Arial" w:hAnsi="Arial" w:cs="Arial"/>
         </w:rPr>
         <w:t>Tant l’entrada inicial com la final NO estan assignades a les andanes corresponents</w:t>
+      </w:r>
+    </w:p>
+    <w:p>
+      <w:pPr>
+        <w:pStyle w:val="ListParagraph"/>
+        <w:numPr>
+          <w:ilvl w:val="0"/>
+          <w:numId w:val="1"/>
+        </w:numPr>
+        <w:rPr>
+          <w:rFonts w:ascii="Arial" w:hAnsi="Arial" w:cs="Arial"/>
+        </w:rPr>
+      </w:pPr>
+      <w:r>
+        <w:rPr>
+          <w:rFonts w:ascii="Arial" w:hAnsi="Arial" w:cs="Arial"/>
+        </w:rPr>
+        <w:t>2</w:t>
+      </w:r>
+      <w:r>
+        <w:rPr>
+          <w:rFonts w:ascii="Arial" w:hAnsi="Arial" w:cs="Arial"/>
+        </w:rPr>
+        <w:t xml:space="preserve"> de PW</w:t>
+      </w:r>
+      <w:r>
+        <w:rPr>
+          <w:rFonts w:ascii="Arial" w:hAnsi="Arial" w:cs="Arial"/>
+        </w:rPr>
+        <w:t xml:space="preserve"> (</w:t>
+      </w:r>
+      <w:r>
+        <w:rPr>
+          <w:rFonts w:ascii="Arial" w:hAnsi="Arial" w:cs="Arial"/>
+        </w:rPr>
+        <w:t>un per l’entrada inicial i un per la final)</w:t>
       </w:r>
     </w:p>
     <w:p>
@@ -1237,7 +1462,7 @@
         <w:rFonts w:hint="default"/>
       </w:rPr>
     </w:lvl>
-    <w:lvl w:ilvl="1" w:tplc="08090019" w:tentative="1">
+    <w:lvl w:ilvl="1" w:tplc="08090019">
       <w:start w:val="1"/>
       <w:numFmt w:val="lowerLetter"/>
       <w:lvlText w:val="%2."/>
@@ -1311,6 +1536,95 @@
     </w:lvl>
   </w:abstractNum>
   <w:abstractNum w:abstractNumId="1" w15:restartNumberingAfterBreak="0">
+    <w:nsid w:val="304B6A82"/>
+    <w:multiLevelType w:val="hybridMultilevel"/>
+    <w:tmpl w:val="D6A655F6"/>
+    <w:lvl w:ilvl="0" w:tplc="2C7AB330">
+      <w:start w:val="1"/>
+      <w:numFmt w:val="decimal"/>
+      <w:lvlText w:val="%1."/>
+      <w:lvlJc w:val="left"/>
+      <w:pPr>
+        <w:ind w:left="1080" w:hanging="360"/>
+      </w:pPr>
+      <w:rPr>
+        <w:rFonts w:hint="default"/>
+      </w:rPr>
+    </w:lvl>
+    <w:lvl w:ilvl="1" w:tplc="08090019" w:tentative="1">
+      <w:start w:val="1"/>
+      <w:numFmt w:val="lowerLetter"/>
+      <w:lvlText w:val="%2."/>
+      <w:lvlJc w:val="left"/>
+      <w:pPr>
+        <w:ind w:left="1800" w:hanging="360"/>
+      </w:pPr>
+    </w:lvl>
+    <w:lvl w:ilvl="2" w:tplc="0809001B" w:tentative="1">
+      <w:start w:val="1"/>
+      <w:numFmt w:val="lowerRoman"/>
+      <w:lvlText w:val="%3."/>
+      <w:lvlJc w:val="right"/>
+      <w:pPr>
+        <w:ind w:left="2520" w:hanging="180"/>
+      </w:pPr>
+    </w:lvl>
+    <w:lvl w:ilvl="3" w:tplc="0809000F" w:tentative="1">
+      <w:start w:val="1"/>
+      <w:numFmt w:val="decimal"/>
+      <w:lvlText w:val="%4."/>
+      <w:lvlJc w:val="left"/>
+      <w:pPr>
+        <w:ind w:left="3240" w:hanging="360"/>
+      </w:pPr>
+    </w:lvl>
+    <w:lvl w:ilvl="4" w:tplc="08090019" w:tentative="1">
+      <w:start w:val="1"/>
+      <w:numFmt w:val="lowerLetter"/>
+      <w:lvlText w:val="%5."/>
+      <w:lvlJc w:val="left"/>
+      <w:pPr>
+        <w:ind w:left="3960" w:hanging="360"/>
+      </w:pPr>
+    </w:lvl>
+    <w:lvl w:ilvl="5" w:tplc="0809001B" w:tentative="1">
+      <w:start w:val="1"/>
+      <w:numFmt w:val="lowerRoman"/>
+      <w:lvlText w:val="%6."/>
+      <w:lvlJc w:val="right"/>
+      <w:pPr>
+        <w:ind w:left="4680" w:hanging="180"/>
+      </w:pPr>
+    </w:lvl>
+    <w:lvl w:ilvl="6" w:tplc="0809000F" w:tentative="1">
+      <w:start w:val="1"/>
+      <w:numFmt w:val="decimal"/>
+      <w:lvlText w:val="%7."/>
+      <w:lvlJc w:val="left"/>
+      <w:pPr>
+        <w:ind w:left="5400" w:hanging="360"/>
+      </w:pPr>
+    </w:lvl>
+    <w:lvl w:ilvl="7" w:tplc="08090019" w:tentative="1">
+      <w:start w:val="1"/>
+      <w:numFmt w:val="lowerLetter"/>
+      <w:lvlText w:val="%8."/>
+      <w:lvlJc w:val="left"/>
+      <w:pPr>
+        <w:ind w:left="6120" w:hanging="360"/>
+      </w:pPr>
+    </w:lvl>
+    <w:lvl w:ilvl="8" w:tplc="0809001B" w:tentative="1">
+      <w:start w:val="1"/>
+      <w:numFmt w:val="lowerRoman"/>
+      <w:lvlText w:val="%9."/>
+      <w:lvlJc w:val="right"/>
+      <w:pPr>
+        <w:ind w:left="6840" w:hanging="180"/>
+      </w:pPr>
+    </w:lvl>
+  </w:abstractNum>
+  <w:abstractNum w:abstractNumId="2" w15:restartNumberingAfterBreak="0">
     <w:nsid w:val="443A16AE"/>
     <w:multiLevelType w:val="hybridMultilevel"/>
     <w:tmpl w:val="8FECD74E"/>
@@ -1422,7 +1736,7 @@
       </w:rPr>
     </w:lvl>
   </w:abstractNum>
-  <w:abstractNum w:abstractNumId="2" w15:restartNumberingAfterBreak="0">
+  <w:abstractNum w:abstractNumId="3" w15:restartNumberingAfterBreak="0">
     <w:nsid w:val="49283853"/>
     <w:multiLevelType w:val="hybridMultilevel"/>
     <w:tmpl w:val="AF48E1AC"/>
@@ -1511,7 +1825,7 @@
       </w:pPr>
     </w:lvl>
   </w:abstractNum>
-  <w:abstractNum w:abstractNumId="3" w15:restartNumberingAfterBreak="0">
+  <w:abstractNum w:abstractNumId="4" w15:restartNumberingAfterBreak="0">
     <w:nsid w:val="51253AAF"/>
     <w:multiLevelType w:val="hybridMultilevel"/>
     <w:tmpl w:val="162AB91A"/>
@@ -1600,7 +1914,7 @@
       </w:pPr>
     </w:lvl>
   </w:abstractNum>
-  <w:abstractNum w:abstractNumId="4" w15:restartNumberingAfterBreak="0">
+  <w:abstractNum w:abstractNumId="5" w15:restartNumberingAfterBreak="0">
     <w:nsid w:val="52A67168"/>
     <w:multiLevelType w:val="hybridMultilevel"/>
     <w:tmpl w:val="D366B0EC"/>
@@ -1689,7 +2003,7 @@
       </w:pPr>
     </w:lvl>
   </w:abstractNum>
-  <w:abstractNum w:abstractNumId="5" w15:restartNumberingAfterBreak="0">
+  <w:abstractNum w:abstractNumId="6" w15:restartNumberingAfterBreak="0">
     <w:nsid w:val="7CCC0014"/>
     <w:multiLevelType w:val="hybridMultilevel"/>
     <w:tmpl w:val="9A60FE76"/>
@@ -1779,22 +2093,25 @@
     </w:lvl>
   </w:abstractNum>
   <w:num w:numId="1" w16cid:durableId="1368676414">
-    <w:abstractNumId w:val="1"/>
+    <w:abstractNumId w:val="2"/>
   </w:num>
   <w:num w:numId="2" w16cid:durableId="1735815917">
-    <w:abstractNumId w:val="3"/>
+    <w:abstractNumId w:val="4"/>
   </w:num>
   <w:num w:numId="3" w16cid:durableId="1599679976">
-    <w:abstractNumId w:val="5"/>
+    <w:abstractNumId w:val="6"/>
   </w:num>
   <w:num w:numId="4" w16cid:durableId="1897738398">
-    <w:abstractNumId w:val="4"/>
+    <w:abstractNumId w:val="5"/>
   </w:num>
   <w:num w:numId="5" w16cid:durableId="1169708508">
     <w:abstractNumId w:val="0"/>
   </w:num>
   <w:num w:numId="6" w16cid:durableId="571503645">
-    <w:abstractNumId w:val="2"/>
+    <w:abstractNumId w:val="3"/>
+  </w:num>
+  <w:num w:numId="7" w16cid:durableId="1070880340">
+    <w:abstractNumId w:val="1"/>
   </w:num>
 </w:numbering>
 </file>

</xml_diff>